<commit_message>
vpscreen-portfolio-threads: Sandeep Patel backfill complete (all pre-cutoff), 5-thread forward check (flat), 2 discovery candidates rejected on rate/scope
Co-Authored-By: Claude Sonnet 5 <noreply@anthropic.com>
</commit_message>
<xml_diff>
--- a/projects/valuepickr-open-screen/docs/Knowledge Marine.docx
+++ b/projects/valuepickr-open-screen/docs/Knowledge Marine.docx
@@ -1953,7 +1953,7 @@
         <w:spacing w:after="120" w:before="280"/>
       </w:pPr>
       <w:r>
-        <w:t xml:space="preserve">Ishmohit-Lens Checks (value chain · earnings quality · growth trajectory · management · global-signal check)</w:t>
+        <w:t xml:space="preserve">Ishmohit-Lens Checks (value chain · earnings quality · growth trajectory · management · quality metrics · track record · global-signal check)</w:t>
       </w:r>
     </w:p>
     <w:p>
@@ -2406,6 +2406,33 @@
                 <w:b/>
                 <w:bCs/>
               </w:rPr>
+              <w:t xml:space="preserve">Shareholder returns</w:t>
+            </w:r>
+          </w:p>
+        </w:tc>
+        <w:tc>
+          <w:tcPr>
+            <w:tcW w:type="dxa" w:w="5800"/>
+          </w:tcPr>
+          <w:p>
+            <w:r>
+              <w:t xml:space="preserve">—</w:t>
+            </w:r>
+          </w:p>
+        </w:tc>
+      </w:tr>
+      <w:tr>
+        <w:tc>
+          <w:tcPr>
+            <w:tcW w:type="dxa" w:w="3200"/>
+            <w:shd w:fill="F2F2F2" w:val="clear"/>
+          </w:tcPr>
+          <w:p>
+            <w:r>
+              <w:rPr>
+                <w:b/>
+                <w:bCs/>
+              </w:rPr>
               <w:t xml:space="preserve">Capability ladder / VAP</w:t>
             </w:r>
           </w:p>
@@ -2512,7 +2539,7 @@
           <w:sz w:val="20"/>
           <w:szCs w:val="20"/>
         </w:rPr>
-        <w:t xml:space="preserve">2026-06-07 — Prabhat_Mohanty</w:t>
+        <w:t xml:space="preserve">2026-09-20 — suru27 (X)</w:t>
       </w:r>
       <w:r>
         <w:rPr>
@@ -2522,7 +2549,7 @@
           <w:sz w:val="18"/>
           <w:szCs w:val="18"/>
         </w:rPr>
-        <w:t xml:space="preserve"> (Knowledge Marine)</w:t>
+        <w:t xml:space="preserve"> (X / @suru27)</w:t>
       </w:r>
       <w:r>
         <w:rPr>
@@ -2530,7 +2557,7 @@
           <w:szCs w:val="20"/>
         </w:rPr>
         <w:br/>
-        <w:t xml:space="preserve">: Raised concern that rave community reviews plus continued promoter open-market selling after a preferential issue at a lower price is a 'danger signal,' and separately noted an unexplained QoQ topline/bottomline decline in Q4FY26 offset mainly by a deferred-tax write-back.</w:t>
+        <w:t xml:space="preserve">: Dedicated bull case defending 55-60x P/E via 22-49% sales growth, 35-62% PAT growth, 20-62% EPS growth, 60-74% OCF conversion; also flagged a new 3rd Green Tug contract.</w:t>
       </w:r>
     </w:p>
     <w:p>
@@ -2544,7 +2571,7 @@
           <w:sz w:val="20"/>
           <w:szCs w:val="20"/>
         </w:rPr>
-        <w:t xml:space="preserve">2026-03-04 — gaurav</w:t>
+        <w:t xml:space="preserve">2026-06-07 — Prabhat_Mohanty</w:t>
       </w:r>
       <w:r>
         <w:rPr>
@@ -2562,7 +2589,7 @@
           <w:szCs w:val="20"/>
         </w:rPr>
         <w:br/>
-        <w:t xml:space="preserve">: Questioned why the promoter keeps selling stake and for how long, flagged while only tracking without a position - a live, unresolved governance question in the thread.</w:t>
+        <w:t xml:space="preserve">: Raised concern that rave community reviews plus continued promoter open-market selling after a preferential issue at a lower price is a 'danger signal,' and separately noted an unexplained QoQ topline/bottomline decline in Q4FY26 offset mainly by a deferred-tax write-back.</w:t>
       </w:r>
     </w:p>
     <w:p>
@@ -2576,7 +2603,7 @@
           <w:sz w:val="20"/>
           <w:szCs w:val="20"/>
         </w:rPr>
-        <w:t xml:space="preserve">2025-12-16 — vir259</w:t>
+        <w:t xml:space="preserve">2026-03-04 — gaurav</w:t>
       </w:r>
       <w:r>
         <w:rPr>
@@ -2594,6 +2621,38 @@
           <w:szCs w:val="20"/>
         </w:rPr>
         <w:br/>
+        <w:t xml:space="preserve">: Questioned why the promoter keeps selling stake and for how long, flagged while only tracking without a position - a live, unresolved governance question in the thread.</w:t>
+      </w:r>
+    </w:p>
+    <w:p>
+      <w:pPr>
+        <w:spacing w:after="100"/>
+      </w:pPr>
+      <w:r>
+        <w:rPr>
+          <w:b/>
+          <w:bCs/>
+          <w:sz w:val="20"/>
+          <w:szCs w:val="20"/>
+        </w:rPr>
+        <w:t xml:space="preserve">2025-12-16 — vir259</w:t>
+      </w:r>
+      <w:r>
+        <w:rPr>
+          <w:i/>
+          <w:iCs/>
+          <w:color w:val="666666"/>
+          <w:sz w:val="18"/>
+          <w:szCs w:val="18"/>
+        </w:rPr>
+        <w:t xml:space="preserve"> (Knowledge Marine)</w:t>
+      </w:r>
+      <w:r>
+        <w:rPr>
+          <w:sz w:val="20"/>
+          <w:szCs w:val="20"/>
+        </w:rPr>
+        <w:br/>
         <w:t xml:space="preserve">: Framed KMEW's pivot from pure dredging into shipbuilding/port services as riding a strategic national-security-adjacent tailwind (reducing China/Japan/Korea's 90% share of global shipbuilding), with revenue recognition lagging order wins by design given long-cycle contracts.</w:t>
       </w:r>
     </w:p>
@@ -2791,6 +2850,34 @@
           <w:szCs w:val="24"/>
         </w:rPr>
         <w:t xml:space="preserve">neither</w:t>
+      </w:r>
+    </w:p>
+    <w:p>
+      <w:pPr>
+        <w:spacing w:after="120"/>
+      </w:pPr>
+      <w:r>
+        <w:rPr>
+          <w:color w:val="666666"/>
+          <w:sz w:val="20"/>
+          <w:szCs w:val="20"/>
+        </w:rPr>
+        <w:t xml:space="preserve">4-box gate — tailwind: yes · TAM: yes · moat: weak · valuation: no  (score 2.5 / 4)</w:t>
+      </w:r>
+    </w:p>
+    <w:p>
+      <w:pPr>
+        <w:spacing w:after="120"/>
+      </w:pPr>
+      <w:r>
+        <w:rPr>
+          <w:i/>
+          <w:iCs/>
+          <w:color w:val="666666"/>
+          <w:sz w:val="20"/>
+          <w:szCs w:val="20"/>
+        </w:rPr>
+        <w:t xml:space="preserve">Domestic shipbuilding import-substitution push + Jalvahak inland-waterways scheme + tonnage-tax regime is a real government-policy tailwind; order book (~6x FY26 revenue) + 15yr green-tug contracts to 2042 support tam; sole-executor no-JV model is a real but modest operational edge, and management's 'Rs1,000cr by 2035' framing is aspirational without precise guidance — moat weak; Q1 FY27's 64% OPM blowout is largely deferred billing from a weak Q4 — trailing ~55x P/E is on flattered earnings, sell-side target ~20% below spot — valuation no. Promoter holding falling (73%-&gt;51.56%) with fresh open-market selling is a separate caution.</w:t>
       </w:r>
     </w:p>
     <w:p>

</xml_diff>